<commit_message>
Add resume page at /resume.html
Web version of the 2026 resume styled in the portfolio system, with
PDF and DOCX downloads. Sitemap updated.

Co-Authored-By: Claude Opus 4.7 <noreply@anthropic.com>
</commit_message>
<xml_diff>
--- a/Justin_Francisco_Resume_2026.docx
+++ b/Justin_Francisco_Resume_2026.docx
@@ -3,14 +3,11 @@
 <w:document xmlns:wpc="http://schemas.microsoft.com/office/word/2010/wordprocessingCanvas" xmlns:cx="http://schemas.microsoft.com/office/drawing/2014/chartex" xmlns:cx1="http://schemas.microsoft.com/office/drawing/2015/9/8/chartex" xmlns:cx2="http://schemas.microsoft.com/office/drawing/2015/10/21/chartex" xmlns:cx3="http://schemas.microsoft.com/office/drawing/2016/5/9/chartex" xmlns:cx4="http://schemas.microsoft.com/office/drawing/2016/5/10/chartex" xmlns:cx5="http://schemas.microsoft.com/office/drawing/2016/5/11/chartex" xmlns:cx6="http://schemas.microsoft.com/office/drawing/2016/5/12/chartex" xmlns:cx7="http://schemas.microsoft.com/office/drawing/2016/5/13/chartex" xmlns:cx8="http://schemas.microsoft.com/office/drawing/2016/5/14/chartex" xmlns:mc="http://schemas.openxmlformats.org/markup-compatibility/2006" xmlns:aink="http://schemas.microsoft.com/office/drawing/2016/ink" xmlns:am3d="http://schemas.microsoft.com/office/drawing/2017/model3d" xmlns:o="urn:schemas-microsoft-com:office:office" xmlns:oel="http://schemas.microsoft.com/office/2019/extlst" xmlns:r="http://schemas.openxmlformats.org/officeDocument/2006/relationships" xmlns:m="http://schemas.openxmlformats.org/officeDocument/2006/math" xmlns:v="urn:schemas-microsoft-com:vml" xmlns:wp14="http://schemas.microsoft.com/office/word/2010/wordprocessingDrawing" xmlns:wp="http://schemas.openxmlformats.org/drawingml/2006/wordprocessingDrawing" xmlns:w10="urn:schemas-microsoft-com:office:word" xmlns:w="http://schemas.openxmlformats.org/wordprocessingml/2006/main" xmlns:w14="http://schemas.microsoft.com/office/word/2010/wordml" xmlns:w15="http://schemas.microsoft.com/office/word/2012/wordml" xmlns:w16cex="http://schemas.microsoft.com/office/word/2018/wordml/cex" xmlns:w16cid="http://schemas.microsoft.com/office/word/2016/wordml/cid" xmlns:w16="http://schemas.microsoft.com/office/word/2018/wordml" xmlns:w16du="http://schemas.microsoft.com/office/word/2023/wordml/word16du" xmlns:w16sdtdh="http://schemas.microsoft.com/office/word/2020/wordml/sdtdatahash" xmlns:w16sdtfl="http://schemas.microsoft.com/office/word/2024/wordml/sdtformatlock" xmlns:w16se="http://schemas.microsoft.com/office/word/2015/wordml/symex" xmlns:wpg="http://schemas.microsoft.com/office/word/2010/wordprocessingGroup" xmlns:wpi="http://schemas.microsoft.com/office/word/2010/wordprocessingInk" xmlns:wne="http://schemas.microsoft.com/office/word/2006/wordml" xmlns:wps="http://schemas.microsoft.com/office/word/2010/wordprocessingShape" mc:Ignorable="w14 w15 w16se w16cid w16 w16cex w16sdtdh w16sdtfl w16du wp14">
   <w:body>
     <w:p>
-      <w:pPr>
-        <w:spacing w:after="40"/>
-      </w:pPr>
       <w:r>
         <w:rPr>
           <w:b/>
           <w:bCs/>
-          <w:color w:val="000000"/>
+          <w:color w:val="222222"/>
           <w:sz w:val="40"/>
           <w:szCs w:val="40"/>
         </w:rPr>
@@ -19,84 +16,44 @@
     </w:p>
     <w:p>
       <w:pPr>
-        <w:spacing w:after="120"/>
+        <w:spacing w:after="40"/>
+        <w:rPr>
+          <w:color w:val="B79400"/>
+        </w:rPr>
       </w:pPr>
       <w:r>
         <w:rPr>
-          <w:color w:val="555555"/>
+          <w:color w:val="B79400"/>
         </w:rPr>
-        <w:t>Strategic Visual Design  ·  10 years experience  ·  Brand, Environmental, Digital, Motion</w:t>
-      </w:r>
-    </w:p>
-    <w:p>
-      <w:pPr>
-        <w:spacing w:after="240"/>
-      </w:pPr>
-      <w:r>
-        <w:rPr>
-          <w:sz w:val="19"/>
-          <w:szCs w:val="19"/>
-        </w:rPr>
-        <w:t>Guelph, ON</w:t>
-      </w:r>
-      <w:r>
-        <w:rPr>
-          <w:color w:val="CCCCCC"/>
-          <w:sz w:val="19"/>
-          <w:szCs w:val="19"/>
-        </w:rPr>
-        <w:t xml:space="preserve">   ·   </w:t>
-      </w:r>
-      <w:r>
-        <w:rPr>
-          <w:sz w:val="19"/>
-          <w:szCs w:val="19"/>
-        </w:rPr>
-        <w:t>jtkfrancisco@gmail.com</w:t>
-      </w:r>
-      <w:r>
-        <w:rPr>
-          <w:color w:val="CCCCCC"/>
-          <w:sz w:val="19"/>
-          <w:szCs w:val="19"/>
-        </w:rPr>
-        <w:t xml:space="preserve">   ·   </w:t>
-      </w:r>
-      <w:r>
-        <w:rPr>
-          <w:sz w:val="19"/>
-          <w:szCs w:val="19"/>
-          <w:u w:val="single"/>
-        </w:rPr>
-        <w:t>www.f</w:t>
-      </w:r>
-      <w:r>
-        <w:rPr>
-          <w:sz w:val="19"/>
-          <w:szCs w:val="19"/>
-          <w:u w:val="single"/>
-        </w:rPr>
-        <w:t>rancisco.design</w:t>
+        <w:t>Brand &amp; Creative Direction · $13.3M+ in awarded contract value</w:t>
       </w:r>
     </w:p>
     <w:p>
       <w:pPr>
         <w:pBdr>
-          <w:bottom w:val="single" w:sz="8" w:space="0" w:color="CCCCCC"/>
+          <w:bottom w:val="single" w:sz="4" w:space="4" w:color="auto"/>
         </w:pBdr>
-        <w:spacing w:after="280"/>
+        <w:spacing w:after="160"/>
       </w:pPr>
+      <w:r>
+        <w:rPr>
+          <w:color w:val="555555"/>
+          <w:sz w:val="19"/>
+          <w:szCs w:val="19"/>
+        </w:rPr>
+        <w:t>Guelph, ON   ·   jtkfrancisco@gmail.com   ·   www.francisco.design</w:t>
+      </w:r>
     </w:p>
     <w:tbl>
       <w:tblPr>
-        <w:tblW w:w="5000" w:type="pct"/>
+        <w:tblW w:w="9360" w:type="dxa"/>
         <w:tblBorders>
-          <w:top w:val="single" w:sz="4" w:space="0" w:color="auto"/>
-          <w:left w:val="single" w:sz="4" w:space="0" w:color="auto"/>
-          <w:bottom w:val="single" w:sz="4" w:space="0" w:color="auto"/>
-          <w:right w:val="single" w:sz="4" w:space="0" w:color="auto"/>
-          <w:insideH w:val="single" w:sz="4" w:space="0" w:color="auto"/>
-          <w:insideV w:val="single" w:sz="4" w:space="0" w:color="auto"/>
+          <w:top w:val="none" w:sz="0" w:space="0" w:color="FFFFFF"/>
+          <w:left w:val="none" w:sz="0" w:space="0" w:color="FFFFFF"/>
+          <w:bottom w:val="none" w:sz="0" w:space="0" w:color="FFFFFF"/>
+          <w:right w:val="none" w:sz="0" w:space="0" w:color="FFFFFF"/>
+          <w:insideH w:val="none" w:sz="0" w:space="0" w:color="FFFFFF"/>
+          <w:insideV w:val="none" w:sz="0" w:space="0" w:color="FFFFFF"/>
         </w:tblBorders>
         <w:tblCellMar>
           <w:left w:w="10" w:type="dxa"/>
@@ -105,13 +62,13 @@
         <w:tblLook w:val="04A0" w:firstRow="1" w:lastRow="0" w:firstColumn="1" w:lastColumn="0" w:noHBand="0" w:noVBand="1"/>
       </w:tblPr>
       <w:tblGrid>
-        <w:gridCol w:w="7461"/>
-        <w:gridCol w:w="3627"/>
+        <w:gridCol w:w="6040"/>
+        <w:gridCol w:w="3320"/>
       </w:tblGrid>
       <w:tr>
         <w:tc>
           <w:tcPr>
-            <w:tcW w:w="7200" w:type="dxa"/>
+            <w:tcW w:w="6040" w:type="dxa"/>
             <w:tcBorders>
               <w:top w:val="none" w:sz="0" w:space="0" w:color="FFFFFF"/>
               <w:left w:val="none" w:sz="0" w:space="0" w:color="FFFFFF"/>
@@ -119,292 +76,861 @@
               <w:right w:val="none" w:sz="0" w:space="0" w:color="FFFFFF"/>
             </w:tcBorders>
             <w:tcMar>
-              <w:top w:w="0" w:type="dxa"/>
+              <w:top w:w="80" w:type="dxa"/>
               <w:left w:w="0" w:type="dxa"/>
-              <w:bottom w:w="0" w:type="dxa"/>
-              <w:right w:w="400" w:type="dxa"/>
+              <w:bottom w:w="80" w:type="dxa"/>
+              <w:right w:w="280" w:type="dxa"/>
             </w:tcMar>
           </w:tcPr>
           <w:p>
             <w:pPr>
               <w:spacing w:after="160"/>
-            </w:pPr>
-            <w:r>
-              <w:rPr>
-                <w:b/>
-                <w:bCs/>
-                <w:caps/>
-              </w:rPr>
-              <w:t>EXPERIENCE</w:t>
-            </w:r>
-          </w:p>
-          <w:p>
-            <w:pPr>
-              <w:spacing w:after="40"/>
-            </w:pPr>
-            <w:r>
-              <w:rPr>
-                <w:b/>
-                <w:bCs/>
-                <w:color w:val="000000"/>
+              <w:rPr>
+                <w:color w:val="747474" w:themeColor="background2" w:themeShade="80"/>
+              </w:rPr>
+            </w:pPr>
+            <w:r>
+              <w:rPr>
+                <w:i/>
+                <w:iCs/>
+                <w:color w:val="747474" w:themeColor="background2" w:themeShade="80"/>
+              </w:rPr>
+              <w:t xml:space="preserve">Brand </w:t>
+            </w:r>
+            <w:r>
+              <w:rPr>
+                <w:i/>
+                <w:iCs/>
+                <w:color w:val="747474" w:themeColor="background2" w:themeShade="80"/>
+              </w:rPr>
+              <w:t xml:space="preserve">systems, naming, and environmental design embedded in $13.3M+ awarded annual contract value across education, sports, and corporate sectors in a </w:t>
+            </w:r>
+            <w:r>
+              <w:rPr>
+                <w:i/>
+                <w:iCs/>
+                <w:color w:val="747474" w:themeColor="background2" w:themeShade="80"/>
+              </w:rPr>
+              <w:t xml:space="preserve">single </w:t>
+            </w:r>
+            <w:r>
+              <w:rPr>
+                <w:i/>
+                <w:iCs/>
+                <w:color w:val="747474" w:themeColor="background2" w:themeShade="80"/>
+              </w:rPr>
+              <w:t xml:space="preserve">fiscal year. I </w:t>
+            </w:r>
+            <w:r>
+              <w:rPr>
+                <w:i/>
+                <w:iCs/>
+                <w:color w:val="747474" w:themeColor="background2" w:themeShade="80"/>
+              </w:rPr>
+              <w:t xml:space="preserve">create </w:t>
+            </w:r>
+            <w:r>
+              <w:rPr>
+                <w:i/>
+                <w:iCs/>
+                <w:color w:val="747474" w:themeColor="background2" w:themeShade="80"/>
+              </w:rPr>
+              <w:t xml:space="preserve">strategic </w:t>
+            </w:r>
+            <w:r>
+              <w:rPr>
+                <w:i/>
+                <w:iCs/>
+                <w:color w:val="747474" w:themeColor="background2" w:themeShade="80"/>
+              </w:rPr>
+              <w:t>designs</w:t>
+            </w:r>
+            <w:r>
+              <w:rPr>
+                <w:i/>
+                <w:iCs/>
+                <w:color w:val="747474" w:themeColor="background2" w:themeShade="80"/>
+              </w:rPr>
+              <w:t xml:space="preserve"> that </w:t>
+            </w:r>
+            <w:r>
+              <w:rPr>
+                <w:i/>
+                <w:iCs/>
+                <w:color w:val="747474" w:themeColor="background2" w:themeShade="80"/>
+              </w:rPr>
+              <w:t>win.</w:t>
+            </w:r>
+          </w:p>
+          <w:p>
+            <w:pPr>
+              <w:spacing w:before="200"/>
+              <w:rPr>
+                <w:color w:val="000000" w:themeColor="text1"/>
+              </w:rPr>
+            </w:pPr>
+            <w:r>
+              <w:rPr>
+                <w:b/>
+                <w:bCs/>
+                <w:color w:val="000000" w:themeColor="text1"/>
                 <w:sz w:val="22"/>
                 <w:szCs w:val="22"/>
               </w:rPr>
-              <w:t>Senior Graphic Designer</w:t>
-            </w:r>
-          </w:p>
-          <w:p>
-            <w:pPr>
-              <w:spacing w:after="80"/>
-            </w:pPr>
-            <w:r>
-              <w:rPr>
-                <w:color w:val="888888"/>
-                <w:sz w:val="18"/>
-                <w:szCs w:val="18"/>
-              </w:rPr>
-              <w:t>Compass Group Canada  /  2021 – Present</w:t>
-            </w:r>
-          </w:p>
-          <w:p>
-            <w:pPr>
-              <w:spacing w:after="80"/>
-            </w:pPr>
-            <w:r>
-              <w:rPr>
+              <w:t>SENIOR GRAPHIC DESIGNER</w:t>
+            </w:r>
+          </w:p>
+          <w:p>
+            <w:pPr>
+              <w:spacing w:after="120"/>
+              <w:rPr>
+                <w:color w:val="000000" w:themeColor="text1"/>
+              </w:rPr>
+            </w:pPr>
+            <w:r>
+              <w:rPr>
+                <w:color w:val="000000" w:themeColor="text1"/>
                 <w:sz w:val="19"/>
                 <w:szCs w:val="19"/>
               </w:rPr>
-              <w:t>Lead designer for Canada’s largest foodservice company. Own brand strategy and visual systems across hospitality, healthcare, education, and corrections. Direct photo/video shoots. Establish design workflows and brand guidelines that scale across sectors.</w:t>
-            </w:r>
-            <w:r>
-              <w:rPr>
+              <w:t xml:space="preserve">Compass Group </w:t>
+            </w:r>
+            <w:proofErr w:type="gramStart"/>
+            <w:r>
+              <w:rPr>
+                <w:color w:val="000000" w:themeColor="text1"/>
                 <w:sz w:val="19"/>
                 <w:szCs w:val="19"/>
               </w:rPr>
-              <w:br/>
-            </w:r>
-          </w:p>
-          <w:p>
-            <w:pPr>
-              <w:spacing w:after="60"/>
-              <w:ind w:left="180"/>
-              <w:rPr>
+              <w:t>Canada  /</w:t>
+            </w:r>
+            <w:proofErr w:type="gramEnd"/>
+            <w:r>
+              <w:rPr>
+                <w:color w:val="000000" w:themeColor="text1"/>
                 <w:sz w:val="19"/>
                 <w:szCs w:val="19"/>
               </w:rPr>
-            </w:pPr>
-            <w:r>
-              <w:rPr>
-                <w:b/>
-                <w:bCs/>
+              <w:t xml:space="preserve">  2021 – Present</w:t>
+            </w:r>
+          </w:p>
+          <w:p>
+            <w:pPr>
+              <w:spacing w:after="140"/>
+              <w:rPr>
+                <w:color w:val="747474" w:themeColor="background2" w:themeShade="80"/>
+              </w:rPr>
+            </w:pPr>
+            <w:r>
+              <w:rPr>
+                <w:color w:val="747474" w:themeColor="background2" w:themeShade="80"/>
+              </w:rPr>
+              <w:t xml:space="preserve">Senior graphic designer for Canada's largest foodservice company. I </w:t>
+            </w:r>
+            <w:r>
+              <w:rPr>
+                <w:color w:val="747474" w:themeColor="background2" w:themeShade="80"/>
+              </w:rPr>
+              <w:t>build</w:t>
+            </w:r>
+            <w:r>
+              <w:rPr>
+                <w:color w:val="747474" w:themeColor="background2" w:themeShade="80"/>
+              </w:rPr>
+              <w:t xml:space="preserve"> brand strategy and visual systems across hospitality, education, sports, and corporate sectors</w:t>
+            </w:r>
+            <w:r>
+              <w:rPr>
+                <w:color w:val="747474" w:themeColor="background2" w:themeShade="80"/>
+              </w:rPr>
+              <w:t>.</w:t>
+            </w:r>
+            <w:r>
+              <w:rPr>
+                <w:color w:val="747474" w:themeColor="background2" w:themeShade="80"/>
+              </w:rPr>
+              <w:t xml:space="preserve"> Develop station brand concepts, naming, and environmental direction from wordmark to signage. Direct photo and video shoots.</w:t>
+            </w:r>
+          </w:p>
+          <w:p>
+            <w:pPr>
+              <w:spacing w:before="60" w:after="100"/>
+            </w:pPr>
+            <w:r>
+              <w:rPr>
+                <w:b/>
+                <w:bCs/>
+                <w:color w:val="222222"/>
                 <w:sz w:val="19"/>
                 <w:szCs w:val="19"/>
               </w:rPr>
-              <w:t xml:space="preserve">Dalhousie University </w:t>
-            </w:r>
-            <w:r>
-              <w:rPr>
+              <w:t xml:space="preserve">Awarded </w:t>
+            </w:r>
+            <w:r>
+              <w:rPr>
+                <w:b/>
+                <w:bCs/>
+                <w:color w:val="222222"/>
                 <w:sz w:val="19"/>
                 <w:szCs w:val="19"/>
               </w:rPr>
-              <w:t xml:space="preserve">— </w:t>
-            </w:r>
-            <w:r>
-              <w:rPr>
+              <w:t xml:space="preserve">Contracts </w:t>
+            </w:r>
+            <w:r>
+              <w:rPr>
+                <w:b/>
+                <w:bCs/>
+                <w:color w:val="222222"/>
                 <w:sz w:val="19"/>
                 <w:szCs w:val="19"/>
               </w:rPr>
-              <w:t xml:space="preserve">Enterprise-scale brand architecture that helped win $180M RFP. Designed 13 unified location brands across 5 dining halls and 8+ cafés spanning 2 campuses. Built modular system flexible enough for individual venue identity while maintaining </w:t>
-            </w:r>
-            <w:r>
-              <w:rPr>
+              <w:t xml:space="preserve">— </w:t>
+            </w:r>
+            <w:r>
+              <w:rPr>
+                <w:b/>
+                <w:bCs/>
+                <w:color w:val="222222"/>
                 <w:sz w:val="19"/>
                 <w:szCs w:val="19"/>
               </w:rPr>
-              <w:t>brand</w:t>
-            </w:r>
-            <w:r>
-              <w:rPr>
+              <w:t>C</w:t>
+            </w:r>
+            <w:r>
+              <w:rPr>
+                <w:b/>
+                <w:bCs/>
+                <w:color w:val="222222"/>
                 <w:sz w:val="19"/>
                 <w:szCs w:val="19"/>
               </w:rPr>
-              <w:t xml:space="preserve"> cohesion.</w:t>
-            </w:r>
-            <w:r>
-              <w:rPr>
+              <w:t xml:space="preserve">reative </w:t>
+            </w:r>
+            <w:r>
+              <w:rPr>
+                <w:b/>
+                <w:bCs/>
+                <w:color w:val="222222"/>
                 <w:sz w:val="19"/>
                 <w:szCs w:val="19"/>
               </w:rPr>
+              <w:t>Lead</w:t>
+            </w:r>
+          </w:p>
+          <w:p>
+            <w:pPr>
+              <w:spacing w:after="140"/>
+              <w:rPr>
+                <w:color w:val="747474" w:themeColor="background2" w:themeShade="80"/>
+              </w:rPr>
+            </w:pPr>
+            <w:r>
+              <w:rPr>
+                <w:b/>
+                <w:bCs/>
+                <w:color w:val="222222"/>
+              </w:rPr>
+              <w:t xml:space="preserve">Algonquin College </w:t>
+            </w:r>
+            <w:r>
+              <w:rPr>
+                <w:i/>
+                <w:iCs/>
+                <w:color w:val="747474" w:themeColor="background2" w:themeShade="80"/>
+              </w:rPr>
+              <w:t>($9.0M annual)</w:t>
+            </w:r>
+            <w:r>
+              <w:rPr>
+                <w:b/>
+                <w:bCs/>
+                <w:color w:val="747474" w:themeColor="background2" w:themeShade="80"/>
+              </w:rPr>
+              <w:t xml:space="preserve"> </w:t>
+            </w:r>
+            <w:r>
+              <w:rPr>
+                <w:color w:val="747474" w:themeColor="background2" w:themeShade="80"/>
+              </w:rPr>
+              <w:t>New campus dining program built to read as an extension of the college itself. I drew the Algonquin green, institutional typography, and logo cues into a family of station brands — The Grill House, Bagel Den, and a grab-and-go market — so each venue felt distinct but unmistakably Algonquin. The largest education award in the year's pipeline.</w:t>
+            </w:r>
+          </w:p>
+          <w:p>
+            <w:pPr>
+              <w:spacing w:after="140"/>
+              <w:rPr>
+                <w:b/>
+                <w:bCs/>
+                <w:color w:val="222222"/>
+              </w:rPr>
+            </w:pPr>
+            <w:r>
+              <w:rPr>
+                <w:b/>
+                <w:bCs/>
+                <w:color w:val="222222"/>
+              </w:rPr>
+              <w:t xml:space="preserve">King's University College </w:t>
+            </w:r>
+            <w:r>
+              <w:rPr>
+                <w:i/>
+                <w:iCs/>
+                <w:color w:val="747474" w:themeColor="background2" w:themeShade="80"/>
+              </w:rPr>
+              <w:t>($2.4M annual)</w:t>
+            </w:r>
+            <w:r>
+              <w:rPr>
+                <w:color w:val="747474" w:themeColor="background2" w:themeShade="80"/>
+              </w:rPr>
+              <w:t xml:space="preserve"> The King's Table dining brand, built directly from the institution's own identity — crest, colors, and typography — so the program reads as the school, not an outside vendor. A sub-brand designed to inherit trust rather than introduce a new logo to learn.</w:t>
+            </w:r>
+          </w:p>
+          <w:p>
+            <w:pPr>
+              <w:spacing w:after="140"/>
+              <w:rPr>
+                <w:b/>
+                <w:bCs/>
+                <w:color w:val="222222"/>
+              </w:rPr>
+            </w:pPr>
+            <w:r>
+              <w:rPr>
+                <w:b/>
+                <w:bCs/>
+                <w:color w:val="222222"/>
+              </w:rPr>
+              <w:t xml:space="preserve">Progressive Arena </w:t>
+            </w:r>
+            <w:r>
+              <w:rPr>
+                <w:i/>
+                <w:iCs/>
+                <w:color w:val="747474" w:themeColor="background2" w:themeShade="80"/>
+              </w:rPr>
+              <w:t>(</w:t>
+            </w:r>
+            <w:r>
+              <w:rPr>
+                <w:i/>
+                <w:iCs/>
+                <w:color w:val="747474" w:themeColor="background2" w:themeShade="80"/>
+              </w:rPr>
+              <w:t>$1.9M annual, 10-yr term)</w:t>
+            </w:r>
+            <w:r>
+              <w:rPr>
+                <w:color w:val="747474" w:themeColor="background2" w:themeShade="80"/>
+              </w:rPr>
+              <w:t xml:space="preserve"> </w:t>
+            </w:r>
+            <w:r>
+              <w:rPr>
+                <w:color w:val="747474" w:themeColor="background2" w:themeShade="80"/>
+              </w:rPr>
+              <w:t>Top-to-bottom venue refresh for a decade-long partnership — VIP suites, environmental branding for kids' areas, wayfinding, and concourse, all tied to a single family that pulls from the Sarnia Sting identity. District 94</w:t>
+            </w:r>
+            <w:r>
+              <w:rPr>
+                <w:color w:val="747474" w:themeColor="background2" w:themeShade="80"/>
+              </w:rPr>
+              <w:t xml:space="preserve"> is the pinnacle of the system—</w:t>
+            </w:r>
+            <w:r>
+              <w:rPr>
+                <w:color w:val="747474" w:themeColor="background2" w:themeShade="80"/>
+              </w:rPr>
+              <w:t>a new bar and eatery (named for the arena's 1994 founding) built to draw as a standalone destination, not just somewhere people end up because they're already at the game.</w:t>
+            </w:r>
+            <w:r>
+              <w:rPr>
+                <w:b/>
+                <w:bCs/>
+                <w:color w:val="747474" w:themeColor="background2" w:themeShade="80"/>
+              </w:rPr>
+              <w:t xml:space="preserve"> </w:t>
+            </w:r>
+            <w:r>
+              <w:rPr>
+                <w:b/>
+                <w:bCs/>
+                <w:color w:val="222222"/>
+              </w:rPr>
               <w:br/>
             </w:r>
           </w:p>
           <w:p>
             <w:pPr>
-              <w:spacing w:after="60"/>
-              <w:ind w:left="180"/>
-            </w:pPr>
-            <w:r>
-              <w:rPr>
-                <w:b/>
-                <w:bCs/>
+              <w:spacing w:before="100" w:after="100"/>
+            </w:pPr>
+            <w:r>
+              <w:rPr>
+                <w:b/>
+                <w:bCs/>
+                <w:color w:val="222222"/>
                 <w:sz w:val="19"/>
                 <w:szCs w:val="19"/>
               </w:rPr>
-              <w:t xml:space="preserve">Sarnia Arena </w:t>
-            </w:r>
-            <w:r>
-              <w:rPr>
+              <w:t>Competitive bid &amp; flagship accounts</w:t>
+            </w:r>
+          </w:p>
+          <w:p>
+            <w:pPr>
+              <w:spacing w:after="140"/>
+            </w:pPr>
+            <w:r>
+              <w:rPr>
+                <w:b/>
+                <w:bCs/>
+                <w:color w:val="222222"/>
+              </w:rPr>
+              <w:t>York University — YU Eats —</w:t>
+            </w:r>
+            <w:r>
+              <w:rPr>
+                <w:color w:val="747474" w:themeColor="background2" w:themeShade="80"/>
+              </w:rPr>
+              <w:t xml:space="preserve"> </w:t>
+            </w:r>
+            <w:r>
+              <w:rPr>
+                <w:color w:val="747474" w:themeColor="background2" w:themeShade="80"/>
+              </w:rPr>
+              <w:t xml:space="preserve">Brand and environmental system for the CSQ food hall and satellite locations, including </w:t>
+            </w:r>
+            <w:r>
+              <w:rPr>
+                <w:color w:val="747474" w:themeColor="background2" w:themeShade="80"/>
+              </w:rPr>
+              <w:t xml:space="preserve">unified </w:t>
+            </w:r>
+            <w:r>
+              <w:rPr>
+                <w:color w:val="747474" w:themeColor="background2" w:themeShade="80"/>
+              </w:rPr>
+              <w:t>station identitie</w:t>
+            </w:r>
+            <w:r>
+              <w:rPr>
+                <w:color w:val="747474" w:themeColor="background2" w:themeShade="80"/>
+              </w:rPr>
+              <w:t>s</w:t>
+            </w:r>
+            <w:r>
+              <w:rPr>
+                <w:color w:val="747474" w:themeColor="background2" w:themeShade="80"/>
+              </w:rPr>
+              <w:t xml:space="preserve">. A refresh program </w:t>
+            </w:r>
+            <w:r>
+              <w:rPr>
+                <w:color w:val="747474" w:themeColor="background2" w:themeShade="80"/>
+              </w:rPr>
+              <w:t>that revitalized</w:t>
+            </w:r>
+            <w:r>
+              <w:rPr>
+                <w:color w:val="747474" w:themeColor="background2" w:themeShade="80"/>
+              </w:rPr>
+              <w:t xml:space="preserve"> a flagship account.</w:t>
+            </w:r>
+          </w:p>
+          <w:p>
+            <w:pPr>
+              <w:spacing w:after="140"/>
+            </w:pPr>
+            <w:r>
+              <w:rPr>
+                <w:b/>
+                <w:bCs/>
+                <w:color w:val="222222"/>
+              </w:rPr>
+              <w:t xml:space="preserve">Redeemer University — </w:t>
+            </w:r>
+            <w:r>
+              <w:rPr>
+                <w:color w:val="555555"/>
+              </w:rPr>
+              <w:t>H</w:t>
+            </w:r>
+            <w:r>
+              <w:rPr>
+                <w:color w:val="747474" w:themeColor="background2" w:themeShade="80"/>
+              </w:rPr>
+              <w:t xml:space="preserve">ospitality brand and logo developed for a competitive RFP (Chartwells, $2.6M annual). </w:t>
+            </w:r>
+          </w:p>
+          <w:p>
+            <w:pPr>
+              <w:spacing w:after="140"/>
+            </w:pPr>
+            <w:r>
+              <w:rPr>
+                <w:b/>
+                <w:bCs/>
+                <w:color w:val="222222"/>
+              </w:rPr>
+              <w:t xml:space="preserve">Sarnia Arena — </w:t>
+            </w:r>
+            <w:r>
+              <w:rPr>
+                <w:color w:val="747474" w:themeColor="background2" w:themeShade="80"/>
+              </w:rPr>
+              <w:t xml:space="preserve">Full venue </w:t>
+            </w:r>
+            <w:proofErr w:type="gramStart"/>
+            <w:r>
+              <w:rPr>
+                <w:color w:val="747474" w:themeColor="background2" w:themeShade="80"/>
+              </w:rPr>
+              <w:t>rebrand</w:t>
+            </w:r>
+            <w:proofErr w:type="gramEnd"/>
+            <w:r>
+              <w:rPr>
+                <w:color w:val="747474" w:themeColor="background2" w:themeShade="80"/>
+              </w:rPr>
+              <w:t xml:space="preserve"> in 2 weeks from concept to print. Brand identity, wayfinding, and environmental graphics for premium suites, restaurant, bar, and concourse. Met a hard season-opener deadline.</w:t>
+            </w:r>
+            <w:r>
+              <w:rPr>
+                <w:color w:val="747474" w:themeColor="background2" w:themeShade="80"/>
+              </w:rPr>
+              <w:br/>
+            </w:r>
+            <w:r>
+              <w:rPr>
+                <w:color w:val="747474" w:themeColor="background2" w:themeShade="80"/>
+              </w:rPr>
+              <w:br/>
+            </w:r>
+          </w:p>
+          <w:p>
+            <w:pPr>
+              <w:spacing w:before="100" w:after="100"/>
+            </w:pPr>
+            <w:r>
+              <w:rPr>
+                <w:b/>
+                <w:bCs/>
+                <w:color w:val="222222"/>
                 <w:sz w:val="19"/>
                 <w:szCs w:val="19"/>
               </w:rPr>
-              <w:t xml:space="preserve">— </w:t>
-            </w:r>
-            <w:r>
-              <w:t>Full venue rebrand in 2 weeks from concept to print. Delivered brand identity, wayfinding system, environmental graphics for premium suites, restaurant (BuzzSocial), bar (Hall of Fame), and concourse. Met hard deadline for season opener.</w:t>
-            </w:r>
-            <w:r>
-              <w:rPr>
+              <w:lastRenderedPageBreak/>
+              <w:t>Strategy &amp; systems</w:t>
+            </w:r>
+          </w:p>
+          <w:p>
+            <w:pPr>
+              <w:spacing w:after="140"/>
+              <w:rPr>
+                <w:color w:val="747474" w:themeColor="background2" w:themeShade="80"/>
+              </w:rPr>
+            </w:pPr>
+            <w:r>
+              <w:rPr>
+                <w:b/>
+                <w:bCs/>
+                <w:color w:val="222222"/>
+              </w:rPr>
+              <w:t xml:space="preserve">Foundations 2026 — </w:t>
+            </w:r>
+            <w:r>
+              <w:rPr>
+                <w:color w:val="747474" w:themeColor="background2" w:themeShade="80"/>
+              </w:rPr>
+              <w:t>Redesigned</w:t>
+            </w:r>
+            <w:r>
+              <w:rPr>
+                <w:color w:val="747474" w:themeColor="background2" w:themeShade="80"/>
+              </w:rPr>
+              <w:t xml:space="preserve"> a sprawling station</w:t>
+            </w:r>
+            <w:r>
+              <w:rPr>
+                <w:color w:val="747474" w:themeColor="background2" w:themeShade="80"/>
+              </w:rPr>
+              <w:t xml:space="preserve"> concept</w:t>
+            </w:r>
+            <w:r>
+              <w:rPr>
+                <w:color w:val="747474" w:themeColor="background2" w:themeShade="80"/>
+              </w:rPr>
+              <w:t xml:space="preserve"> portfolio into a tight, equipment-driven framework</w:t>
+            </w:r>
+            <w:r>
+              <w:rPr>
+                <w:color w:val="747474" w:themeColor="background2" w:themeShade="80"/>
+              </w:rPr>
+              <w:t xml:space="preserve"> that works across 300+ </w:t>
+            </w:r>
+            <w:proofErr w:type="gramStart"/>
+            <w:r>
+              <w:rPr>
+                <w:color w:val="747474" w:themeColor="background2" w:themeShade="80"/>
+              </w:rPr>
+              <w:t>units</w:t>
+            </w:r>
+            <w:proofErr w:type="gramEnd"/>
+            <w:r>
+              <w:rPr>
+                <w:color w:val="747474" w:themeColor="background2" w:themeShade="80"/>
+              </w:rPr>
+              <w:t xml:space="preserve"> country-wide</w:t>
+            </w:r>
+            <w:r>
+              <w:rPr>
+                <w:color w:val="747474" w:themeColor="background2" w:themeShade="80"/>
+              </w:rPr>
+              <w:t>.</w:t>
+            </w:r>
+          </w:p>
+          <w:p>
+            <w:pPr>
+              <w:spacing w:after="140"/>
+            </w:pPr>
+            <w:r>
+              <w:rPr>
+                <w:b/>
+                <w:bCs/>
+                <w:color w:val="222222"/>
+              </w:rPr>
+              <w:t>North</w:t>
+            </w:r>
+            <w:r>
+              <w:rPr>
+                <w:b/>
+                <w:bCs/>
+                <w:color w:val="222222"/>
+              </w:rPr>
+              <w:t>w</w:t>
+            </w:r>
+            <w:r>
+              <w:rPr>
+                <w:b/>
+                <w:bCs/>
+                <w:color w:val="222222"/>
+              </w:rPr>
+              <w:t xml:space="preserve">ood Corrections — </w:t>
+            </w:r>
+            <w:r>
+              <w:rPr>
+                <w:color w:val="747474" w:themeColor="background2" w:themeShade="80"/>
+              </w:rPr>
+              <w:t xml:space="preserve">Naming and full multi-registry trademark clearance, </w:t>
+            </w:r>
+            <w:r>
+              <w:rPr>
+                <w:color w:val="747474" w:themeColor="background2" w:themeShade="80"/>
+              </w:rPr>
+              <w:t>for Compass Group Canada’s Corrections sector—</w:t>
+            </w:r>
+            <w:r>
+              <w:rPr>
+                <w:color w:val="747474" w:themeColor="background2" w:themeShade="80"/>
+              </w:rPr>
+              <w:t xml:space="preserve">delivered as a complete rationale and </w:t>
+            </w:r>
+            <w:r>
+              <w:rPr>
+                <w:color w:val="747474" w:themeColor="background2" w:themeShade="80"/>
+              </w:rPr>
+              <w:t>brand</w:t>
+            </w:r>
+            <w:r>
+              <w:rPr>
+                <w:color w:val="747474" w:themeColor="background2" w:themeShade="80"/>
+              </w:rPr>
+              <w:t xml:space="preserve"> package.</w:t>
+            </w:r>
+          </w:p>
+          <w:p>
+            <w:pPr>
+              <w:spacing w:before="200"/>
+            </w:pPr>
+            <w:r>
+              <w:rPr>
+                <w:b/>
+                <w:bCs/>
+                <w:color w:val="222222"/>
+                <w:sz w:val="22"/>
+                <w:szCs w:val="22"/>
+              </w:rPr>
+              <w:t>GRAPHIC DESIGNER</w:t>
+            </w:r>
+          </w:p>
+          <w:p>
+            <w:pPr>
+              <w:spacing w:after="120"/>
+              <w:rPr>
+                <w:color w:val="000000" w:themeColor="text1"/>
+              </w:rPr>
+            </w:pPr>
+            <w:r>
+              <w:rPr>
+                <w:color w:val="000000" w:themeColor="text1"/>
                 <w:sz w:val="19"/>
                 <w:szCs w:val="19"/>
               </w:rPr>
-              <w:br/>
-            </w:r>
-          </w:p>
-          <w:p>
-            <w:pPr>
-              <w:spacing w:after="160"/>
-              <w:ind w:left="180"/>
-            </w:pPr>
-            <w:r>
-              <w:rPr>
-                <w:b/>
-                <w:bCs/>
-              </w:rPr>
-              <w:t>Northwood Corrections Culinary Services</w:t>
-            </w:r>
-            <w:r>
-              <w:t xml:space="preserve"> </w:t>
-            </w:r>
-            <w:r>
-              <w:rPr>
+              <w:t xml:space="preserve">Compass Group Canada (Restaurant </w:t>
+            </w:r>
+            <w:proofErr w:type="gramStart"/>
+            <w:r>
+              <w:rPr>
+                <w:color w:val="000000" w:themeColor="text1"/>
                 <w:sz w:val="19"/>
                 <w:szCs w:val="19"/>
               </w:rPr>
-              <w:t xml:space="preserve">— </w:t>
-            </w:r>
-            <w:r>
-              <w:rPr>
+              <w:t>Associates)  /</w:t>
+            </w:r>
+            <w:proofErr w:type="gramEnd"/>
+            <w:r>
+              <w:rPr>
+                <w:color w:val="000000" w:themeColor="text1"/>
                 <w:sz w:val="19"/>
                 <w:szCs w:val="19"/>
               </w:rPr>
-              <w:t xml:space="preserve">Led end to end rebrand of Compass Group Canada’s corrections foodservice sector. Developed naming strategy, visual identity, and scalable brand system balancing institutional trust with human dignity. Managed DEI, legal, and executive approvals. </w:t>
-            </w:r>
-            <w:r>
-              <w:rPr>
+              <w:t xml:space="preserve">  2020 – 2021</w:t>
+            </w:r>
+          </w:p>
+          <w:p>
+            <w:pPr>
+              <w:spacing w:after="80"/>
+              <w:rPr>
+                <w:color w:val="747474" w:themeColor="background2" w:themeShade="80"/>
+              </w:rPr>
+            </w:pPr>
+            <w:r>
+              <w:rPr>
+                <w:color w:val="747474" w:themeColor="background2" w:themeShade="80"/>
+              </w:rPr>
+              <w:t>Brand and marketing materials for corporate dining clients including Microsoft, CIBC, RBC, and Rogers.</w:t>
+            </w:r>
+          </w:p>
+          <w:p>
+            <w:pPr>
+              <w:spacing w:before="200"/>
+            </w:pPr>
+            <w:r>
+              <w:rPr>
+                <w:b/>
+                <w:bCs/>
+                <w:color w:val="222222"/>
+                <w:sz w:val="22"/>
+                <w:szCs w:val="22"/>
+              </w:rPr>
+              <w:t>MOTION GRAPHIC DESIGNER</w:t>
+            </w:r>
+          </w:p>
+          <w:p>
+            <w:pPr>
+              <w:spacing w:after="120"/>
+              <w:rPr>
+                <w:color w:val="000000" w:themeColor="text1"/>
+              </w:rPr>
+            </w:pPr>
+            <w:r>
+              <w:rPr>
+                <w:color w:val="000000" w:themeColor="text1"/>
                 <w:sz w:val="19"/>
                 <w:szCs w:val="19"/>
               </w:rPr>
-              <w:br/>
-            </w:r>
-            <w:r>
-              <w:rPr>
+              <w:t xml:space="preserve">CityNews / </w:t>
+            </w:r>
+            <w:proofErr w:type="spellStart"/>
+            <w:proofErr w:type="gramStart"/>
+            <w:r>
+              <w:rPr>
+                <w:color w:val="000000" w:themeColor="text1"/>
                 <w:sz w:val="19"/>
                 <w:szCs w:val="19"/>
               </w:rPr>
-              <w:br/>
-            </w:r>
-            <w:r>
-              <w:rPr>
-                <w:b/>
-                <w:bCs/>
+              <w:t>CityTV</w:t>
+            </w:r>
+            <w:proofErr w:type="spellEnd"/>
+            <w:r>
+              <w:rPr>
+                <w:color w:val="000000" w:themeColor="text1"/>
                 <w:sz w:val="19"/>
                 <w:szCs w:val="19"/>
               </w:rPr>
-              <w:t xml:space="preserve">York University </w:t>
-            </w:r>
-            <w:r>
-              <w:rPr>
+              <w:t xml:space="preserve">  /</w:t>
+            </w:r>
+            <w:proofErr w:type="gramEnd"/>
+            <w:r>
+              <w:rPr>
+                <w:color w:val="000000" w:themeColor="text1"/>
                 <w:sz w:val="19"/>
                 <w:szCs w:val="19"/>
               </w:rPr>
-              <w:t xml:space="preserve">— </w:t>
-            </w:r>
-            <w:r>
-              <w:rPr>
+              <w:t xml:space="preserve">  2018 – 2020</w:t>
+            </w:r>
+          </w:p>
+          <w:p>
+            <w:pPr>
+              <w:spacing w:after="80"/>
+              <w:rPr>
+                <w:color w:val="747474" w:themeColor="background2" w:themeShade="80"/>
+              </w:rPr>
+            </w:pPr>
+            <w:r>
+              <w:rPr>
+                <w:color w:val="747474" w:themeColor="background2" w:themeShade="80"/>
+              </w:rPr>
+              <w:t>Broadcast motion graphics including the 2019 Federal Leader's Debate. Daily assets for national news on live deadlines.</w:t>
+            </w:r>
+          </w:p>
+          <w:p>
+            <w:pPr>
+              <w:spacing w:before="200"/>
+            </w:pPr>
+            <w:r>
+              <w:rPr>
+                <w:b/>
+                <w:bCs/>
+                <w:color w:val="222222"/>
+                <w:sz w:val="22"/>
+                <w:szCs w:val="22"/>
+              </w:rPr>
+              <w:t>FREELANCE DESIGNER</w:t>
+            </w:r>
+          </w:p>
+          <w:p>
+            <w:pPr>
+              <w:spacing w:after="120"/>
+              <w:rPr>
+                <w:color w:val="000000" w:themeColor="text1"/>
+              </w:rPr>
+            </w:pPr>
+            <w:r>
+              <w:rPr>
+                <w:color w:val="000000" w:themeColor="text1"/>
                 <w:sz w:val="19"/>
                 <w:szCs w:val="19"/>
               </w:rPr>
-              <w:t>Complete brand identity and mobile ordering app serving 55,000+ students across 70+ dining locations. Designed end-to-end: brand strategy, visual identity, app UI, marketing collateral. Won competitive RFP against established agencies.</w:t>
-            </w:r>
-            <w:r>
-              <w:rPr>
+              <w:t>Self-</w:t>
+            </w:r>
+            <w:proofErr w:type="gramStart"/>
+            <w:r>
+              <w:rPr>
+                <w:color w:val="000000" w:themeColor="text1"/>
                 <w:sz w:val="19"/>
                 <w:szCs w:val="19"/>
               </w:rPr>
-              <w:br/>
-            </w:r>
-          </w:p>
-          <w:p>
-            <w:pPr>
-              <w:spacing w:after="40"/>
-            </w:pPr>
-            <w:r>
-              <w:rPr>
-                <w:b/>
-                <w:bCs/>
-                <w:color w:val="000000"/>
-                <w:sz w:val="22"/>
-                <w:szCs w:val="22"/>
-              </w:rPr>
-              <w:t>Graphic Designer</w:t>
-            </w:r>
-          </w:p>
-          <w:p>
-            <w:pPr>
-              <w:spacing w:after="80"/>
-            </w:pPr>
-            <w:r>
-              <w:rPr>
-                <w:color w:val="888888"/>
-                <w:sz w:val="18"/>
-                <w:szCs w:val="18"/>
-              </w:rPr>
-              <w:t>Compass Group Canada (Restaurant Associates)  /  2020 – 2021</w:t>
-            </w:r>
-          </w:p>
-          <w:p>
-            <w:pPr>
-              <w:spacing w:after="160"/>
-            </w:pPr>
-            <w:r>
-              <w:rPr>
+              <w:t>employed  /</w:t>
+            </w:r>
+            <w:proofErr w:type="gramEnd"/>
+            <w:r>
+              <w:rPr>
+                <w:color w:val="000000" w:themeColor="text1"/>
                 <w:sz w:val="19"/>
                 <w:szCs w:val="19"/>
               </w:rPr>
-              <w:t>Brand and marketing materials for corporate dining clients including Microsoft, CIBC, RBC, and Rogers. Designed visual assets for food service concepts in executive environments.</w:t>
-            </w:r>
-            <w:r>
-              <w:rPr>
-                <w:sz w:val="19"/>
-                <w:szCs w:val="19"/>
-              </w:rPr>
-              <w:br/>
-            </w:r>
-          </w:p>
-          <w:p>
-            <w:pPr>
-              <w:spacing w:after="40"/>
-            </w:pPr>
-            <w:r>
-              <w:rPr>
-                <w:b/>
-                <w:bCs/>
-                <w:color w:val="000000"/>
-                <w:sz w:val="22"/>
-                <w:szCs w:val="22"/>
-              </w:rPr>
-              <w:t>Graphic Designer</w:t>
+              <w:t xml:space="preserve">  2016 – 2018</w:t>
             </w:r>
           </w:p>
           <w:p>
@@ -413,87 +939,15 @@
             </w:pPr>
             <w:r>
               <w:rPr>
-                <w:color w:val="888888"/>
-                <w:sz w:val="18"/>
-                <w:szCs w:val="18"/>
-              </w:rPr>
-              <w:t>CityNews / CityTV  /  2018 – 2020</w:t>
-            </w:r>
-          </w:p>
-          <w:p>
-            <w:pPr>
-              <w:spacing w:after="160"/>
-            </w:pPr>
-            <w:r>
-              <w:rPr>
-                <w:sz w:val="19"/>
-                <w:szCs w:val="19"/>
-              </w:rPr>
-              <w:t>Motion graphics for broadcast including</w:t>
-            </w:r>
-            <w:r>
-              <w:rPr>
-                <w:sz w:val="19"/>
-                <w:szCs w:val="19"/>
-              </w:rPr>
-              <w:t xml:space="preserve"> custom graphics for</w:t>
-            </w:r>
-            <w:r>
-              <w:rPr>
-                <w:sz w:val="19"/>
-                <w:szCs w:val="19"/>
-              </w:rPr>
-              <w:t xml:space="preserve"> the 2019 Federal Leader’s Debate. Daily visual assets for national news coverage. Fast turnaround, live deadlines.</w:t>
-            </w:r>
-            <w:r>
-              <w:rPr>
-                <w:sz w:val="19"/>
-                <w:szCs w:val="19"/>
-              </w:rPr>
-              <w:br/>
-            </w:r>
-          </w:p>
-          <w:p>
-            <w:pPr>
-              <w:spacing w:after="40"/>
-            </w:pPr>
-            <w:r>
-              <w:rPr>
-                <w:b/>
-                <w:bCs/>
-                <w:color w:val="000000"/>
-                <w:sz w:val="22"/>
-                <w:szCs w:val="22"/>
-              </w:rPr>
-              <w:t>Freelance Designer</w:t>
-            </w:r>
-          </w:p>
-          <w:p>
-            <w:pPr>
-              <w:spacing w:after="80"/>
-            </w:pPr>
-            <w:r>
-              <w:rPr>
-                <w:color w:val="888888"/>
-                <w:sz w:val="18"/>
-                <w:szCs w:val="18"/>
-              </w:rPr>
-              <w:t>Self-employed  /  2016 – 2018</w:t>
-            </w:r>
-          </w:p>
-          <w:p>
-            <w:r>
-              <w:rPr>
-                <w:sz w:val="19"/>
-                <w:szCs w:val="19"/>
-              </w:rPr>
-              <w:t>Branding, web design, and UI/UX for startups and small businesses. Managed client relationships, scoping, and delivery. Built the business from scratch while completing degree.</w:t>
+                <w:color w:val="747474" w:themeColor="background2" w:themeShade="80"/>
+              </w:rPr>
+              <w:t xml:space="preserve">Branding, web, and UI/UX for startups and small businesses. </w:t>
             </w:r>
           </w:p>
         </w:tc>
         <w:tc>
           <w:tcPr>
-            <w:tcW w:w="3500" w:type="dxa"/>
+            <w:tcW w:w="3320" w:type="dxa"/>
             <w:tcBorders>
               <w:top w:val="none" w:sz="0" w:space="0" w:color="FFFFFF"/>
               <w:left w:val="none" w:sz="0" w:space="0" w:color="FFFFFF"/>
@@ -501,212 +955,451 @@
               <w:right w:val="none" w:sz="0" w:space="0" w:color="FFFFFF"/>
             </w:tcBorders>
             <w:tcMar>
-              <w:top w:w="0" w:type="dxa"/>
+              <w:top w:w="80" w:type="dxa"/>
               <w:left w:w="200" w:type="dxa"/>
-              <w:bottom w:w="0" w:type="dxa"/>
+              <w:bottom w:w="80" w:type="dxa"/>
               <w:right w:w="0" w:type="dxa"/>
             </w:tcMar>
           </w:tcPr>
           <w:p>
             <w:pPr>
-              <w:spacing w:after="160"/>
+              <w:pBdr>
+                <w:bottom w:val="single" w:sz="4" w:space="2" w:color="CCCCCC"/>
+              </w:pBdr>
+              <w:spacing w:before="200" w:after="100"/>
             </w:pPr>
             <w:r>
               <w:rPr>
                 <w:b/>
                 <w:bCs/>
                 <w:caps/>
-              </w:rPr>
-              <w:t>WHAT I DO</w:t>
-            </w:r>
-          </w:p>
-          <w:p>
-            <w:pPr>
-              <w:spacing w:after="60"/>
-            </w:pPr>
-            <w:r>
-              <w:rPr>
-                <w:sz w:val="19"/>
-                <w:szCs w:val="19"/>
-              </w:rPr>
-              <w:t xml:space="preserve">Brand systems &amp; </w:t>
-            </w:r>
-            <w:r>
-              <w:rPr>
-                <w:sz w:val="19"/>
-                <w:szCs w:val="19"/>
-              </w:rPr>
-              <w:t>spaces</w:t>
-            </w:r>
-          </w:p>
-          <w:p>
-            <w:pPr>
-              <w:spacing w:after="60"/>
-            </w:pPr>
-            <w:r>
-              <w:rPr>
-                <w:sz w:val="19"/>
-                <w:szCs w:val="19"/>
+                <w:color w:val="222222"/>
+                <w:sz w:val="17"/>
+                <w:szCs w:val="17"/>
+              </w:rPr>
+              <w:lastRenderedPageBreak/>
+              <w:t>How I Work</w:t>
+            </w:r>
+          </w:p>
+          <w:p>
+            <w:pPr>
+              <w:spacing w:after="100"/>
+            </w:pPr>
+            <w:r>
+              <w:rPr>
+                <w:color w:val="555555"/>
+                <w:sz w:val="18"/>
+                <w:szCs w:val="18"/>
+              </w:rPr>
+              <w:t>I iterate and test</w:t>
+            </w:r>
+            <w:r>
+              <w:rPr>
+                <w:color w:val="555555"/>
+                <w:sz w:val="18"/>
+                <w:szCs w:val="18"/>
+              </w:rPr>
+              <w:t xml:space="preserve"> multitude</w:t>
+            </w:r>
+            <w:r>
+              <w:rPr>
+                <w:color w:val="555555"/>
+                <w:sz w:val="18"/>
+                <w:szCs w:val="18"/>
+              </w:rPr>
+              <w:t>s</w:t>
+            </w:r>
+            <w:r>
+              <w:rPr>
+                <w:color w:val="555555"/>
+                <w:sz w:val="18"/>
+                <w:szCs w:val="18"/>
+              </w:rPr>
+              <w:t xml:space="preserve"> of </w:t>
+            </w:r>
+            <w:r>
+              <w:rPr>
+                <w:color w:val="555555"/>
+                <w:sz w:val="18"/>
+                <w:szCs w:val="18"/>
+              </w:rPr>
+              <w:t>directions, then</w:t>
+            </w:r>
+            <w:r>
+              <w:rPr>
+                <w:color w:val="555555"/>
+                <w:sz w:val="18"/>
+                <w:szCs w:val="18"/>
+              </w:rPr>
+              <w:t xml:space="preserve"> build strong solutions on round one—</w:t>
+            </w:r>
+            <w:r>
+              <w:rPr>
+                <w:color w:val="555555"/>
+                <w:sz w:val="18"/>
+                <w:szCs w:val="18"/>
+              </w:rPr>
+              <w:t>refin</w:t>
+            </w:r>
+            <w:r>
+              <w:rPr>
+                <w:color w:val="555555"/>
+                <w:sz w:val="18"/>
+                <w:szCs w:val="18"/>
+              </w:rPr>
+              <w:t>ing</w:t>
+            </w:r>
+            <w:r>
+              <w:rPr>
+                <w:color w:val="555555"/>
+                <w:sz w:val="18"/>
+                <w:szCs w:val="18"/>
+              </w:rPr>
+              <w:t xml:space="preserve"> </w:t>
+            </w:r>
+            <w:r>
+              <w:rPr>
+                <w:color w:val="555555"/>
+                <w:sz w:val="18"/>
+                <w:szCs w:val="18"/>
+              </w:rPr>
+              <w:t>with judgment built over 10 years in high-pressure environments.</w:t>
+            </w:r>
+          </w:p>
+          <w:p>
+            <w:pPr>
+              <w:pBdr>
+                <w:bottom w:val="single" w:sz="4" w:space="2" w:color="CCCCCC"/>
+              </w:pBdr>
+              <w:spacing w:before="200" w:after="100"/>
+            </w:pPr>
+            <w:r>
+              <w:rPr>
+                <w:b/>
+                <w:bCs/>
+                <w:caps/>
+                <w:color w:val="222222"/>
+                <w:sz w:val="17"/>
+                <w:szCs w:val="17"/>
+              </w:rPr>
+              <w:t>What I Do</w:t>
+            </w:r>
+          </w:p>
+          <w:p>
+            <w:pPr>
+              <w:spacing w:after="40"/>
+            </w:pPr>
+            <w:r>
+              <w:rPr>
+                <w:color w:val="555555"/>
+                <w:sz w:val="18"/>
+                <w:szCs w:val="18"/>
+              </w:rPr>
+              <w:t>Brand systems &amp; spaces</w:t>
+            </w:r>
+          </w:p>
+          <w:p>
+            <w:pPr>
+              <w:spacing w:after="40"/>
+            </w:pPr>
+            <w:r>
+              <w:rPr>
+                <w:color w:val="555555"/>
+                <w:sz w:val="18"/>
+                <w:szCs w:val="18"/>
               </w:rPr>
               <w:t>Creative direction</w:t>
             </w:r>
           </w:p>
           <w:p>
             <w:pPr>
-              <w:spacing w:after="60"/>
-            </w:pPr>
-            <w:r>
-              <w:rPr>
-                <w:sz w:val="19"/>
-                <w:szCs w:val="19"/>
+              <w:spacing w:after="40"/>
+            </w:pPr>
+            <w:r>
+              <w:rPr>
+                <w:color w:val="555555"/>
+                <w:sz w:val="18"/>
+                <w:szCs w:val="18"/>
+              </w:rPr>
+              <w:t>Naming &amp; brand architecture</w:t>
+            </w:r>
+          </w:p>
+          <w:p>
+            <w:pPr>
+              <w:spacing w:after="40"/>
+            </w:pPr>
+            <w:r>
+              <w:rPr>
+                <w:color w:val="555555"/>
+                <w:sz w:val="18"/>
+                <w:szCs w:val="18"/>
               </w:rPr>
               <w:t>Environmental design</w:t>
             </w:r>
           </w:p>
           <w:p>
             <w:pPr>
-              <w:spacing w:after="60"/>
-            </w:pPr>
-            <w:r>
-              <w:rPr>
-                <w:sz w:val="19"/>
-                <w:szCs w:val="19"/>
+              <w:spacing w:after="40"/>
+            </w:pPr>
+            <w:r>
+              <w:rPr>
+                <w:color w:val="555555"/>
+                <w:sz w:val="18"/>
+                <w:szCs w:val="18"/>
               </w:rPr>
               <w:t>Wayfinding systems</w:t>
             </w:r>
           </w:p>
           <w:p>
             <w:pPr>
-              <w:spacing w:after="60"/>
-            </w:pPr>
-            <w:r>
-              <w:rPr>
-                <w:sz w:val="19"/>
-                <w:szCs w:val="19"/>
+              <w:spacing w:after="40"/>
+            </w:pPr>
+            <w:r>
+              <w:rPr>
+                <w:color w:val="555555"/>
+                <w:sz w:val="18"/>
+                <w:szCs w:val="18"/>
               </w:rPr>
               <w:t>Motion &amp; video</w:t>
             </w:r>
           </w:p>
           <w:p>
             <w:pPr>
-              <w:spacing w:after="60"/>
-            </w:pPr>
-            <w:r>
-              <w:rPr>
-                <w:sz w:val="19"/>
-                <w:szCs w:val="19"/>
+              <w:spacing w:after="40"/>
+            </w:pPr>
+            <w:r>
+              <w:rPr>
+                <w:color w:val="555555"/>
+                <w:sz w:val="18"/>
+                <w:szCs w:val="18"/>
               </w:rPr>
               <w:t>3D visualization</w:t>
             </w:r>
           </w:p>
           <w:p>
             <w:pPr>
-              <w:spacing w:after="60"/>
-            </w:pPr>
-            <w:r>
-              <w:rPr>
-                <w:sz w:val="19"/>
-                <w:szCs w:val="19"/>
+              <w:spacing w:after="40"/>
+            </w:pPr>
+            <w:r>
+              <w:rPr>
+                <w:color w:val="555555"/>
+                <w:sz w:val="18"/>
+                <w:szCs w:val="18"/>
               </w:rPr>
               <w:t>UI design &amp; prototyping</w:t>
             </w:r>
           </w:p>
           <w:p>
             <w:pPr>
-              <w:spacing w:after="200"/>
-            </w:pPr>
-            <w:r>
-              <w:rPr>
-                <w:sz w:val="19"/>
-                <w:szCs w:val="19"/>
+              <w:spacing w:after="40"/>
+            </w:pPr>
+            <w:r>
+              <w:rPr>
+                <w:color w:val="555555"/>
+                <w:sz w:val="18"/>
+                <w:szCs w:val="18"/>
               </w:rPr>
               <w:t>Illustration</w:t>
             </w:r>
           </w:p>
           <w:p>
             <w:pPr>
-              <w:spacing w:after="160"/>
+              <w:pBdr>
+                <w:bottom w:val="single" w:sz="4" w:space="2" w:color="CCCCCC"/>
+              </w:pBdr>
+              <w:spacing w:before="200" w:after="100"/>
             </w:pPr>
             <w:r>
               <w:rPr>
                 <w:b/>
                 <w:bCs/>
                 <w:caps/>
-              </w:rPr>
-              <w:t>TOOLS</w:t>
-            </w:r>
-          </w:p>
-          <w:p>
-            <w:pPr>
-              <w:spacing w:after="60"/>
-            </w:pPr>
-            <w:r>
-              <w:rPr>
-                <w:sz w:val="19"/>
-                <w:szCs w:val="19"/>
+                <w:color w:val="222222"/>
+                <w:sz w:val="17"/>
+                <w:szCs w:val="17"/>
+              </w:rPr>
+              <w:t>Trusted By</w:t>
+            </w:r>
+          </w:p>
+          <w:p>
+            <w:pPr>
+              <w:spacing w:after="40"/>
+            </w:pPr>
+            <w:r>
+              <w:rPr>
+                <w:color w:val="555555"/>
+                <w:sz w:val="18"/>
+                <w:szCs w:val="18"/>
+              </w:rPr>
+              <w:t>Compass Group Canada</w:t>
+            </w:r>
+          </w:p>
+          <w:p>
+            <w:pPr>
+              <w:spacing w:after="40"/>
+            </w:pPr>
+            <w:r>
+              <w:rPr>
+                <w:color w:val="555555"/>
+                <w:sz w:val="18"/>
+                <w:szCs w:val="18"/>
+              </w:rPr>
+              <w:t>York University</w:t>
+            </w:r>
+          </w:p>
+          <w:p>
+            <w:pPr>
+              <w:spacing w:after="40"/>
+            </w:pPr>
+            <w:r>
+              <w:rPr>
+                <w:color w:val="555555"/>
+                <w:sz w:val="18"/>
+                <w:szCs w:val="18"/>
+              </w:rPr>
+              <w:t>Dalhousie University</w:t>
+            </w:r>
+          </w:p>
+          <w:p>
+            <w:pPr>
+              <w:spacing w:after="40"/>
+            </w:pPr>
+            <w:r>
+              <w:rPr>
+                <w:color w:val="555555"/>
+                <w:sz w:val="18"/>
+                <w:szCs w:val="18"/>
+              </w:rPr>
+              <w:t>Liberty Entertainment Group</w:t>
+            </w:r>
+          </w:p>
+          <w:p>
+            <w:pPr>
+              <w:spacing w:after="40"/>
+            </w:pPr>
+            <w:r>
+              <w:rPr>
+                <w:color w:val="555555"/>
+                <w:sz w:val="18"/>
+                <w:szCs w:val="18"/>
+              </w:rPr>
+              <w:t>Sarnia Arena</w:t>
+            </w:r>
+          </w:p>
+          <w:p>
+            <w:pPr>
+              <w:spacing w:after="40"/>
+            </w:pPr>
+            <w:r>
+              <w:rPr>
+                <w:color w:val="555555"/>
+                <w:sz w:val="18"/>
+                <w:szCs w:val="18"/>
+              </w:rPr>
+              <w:t>Chestnut Park Real Estate</w:t>
+            </w:r>
+          </w:p>
+          <w:p>
+            <w:pPr>
+              <w:pBdr>
+                <w:bottom w:val="single" w:sz="4" w:space="2" w:color="CCCCCC"/>
+              </w:pBdr>
+              <w:spacing w:before="200" w:after="100"/>
+            </w:pPr>
+            <w:r>
+              <w:rPr>
+                <w:b/>
+                <w:bCs/>
+                <w:caps/>
+                <w:color w:val="222222"/>
+                <w:sz w:val="17"/>
+                <w:szCs w:val="17"/>
+              </w:rPr>
+              <w:t>Tools</w:t>
+            </w:r>
+          </w:p>
+          <w:p>
+            <w:pPr>
+              <w:spacing w:after="40"/>
+            </w:pPr>
+            <w:r>
+              <w:rPr>
+                <w:color w:val="555555"/>
+                <w:sz w:val="18"/>
+                <w:szCs w:val="18"/>
               </w:rPr>
               <w:t>Adobe CC</w:t>
             </w:r>
           </w:p>
           <w:p>
             <w:pPr>
-              <w:spacing w:after="60"/>
-            </w:pPr>
-            <w:r>
-              <w:rPr>
-                <w:sz w:val="19"/>
-                <w:szCs w:val="19"/>
+              <w:spacing w:after="40"/>
+            </w:pPr>
+            <w:r>
+              <w:rPr>
+                <w:color w:val="555555"/>
+                <w:sz w:val="18"/>
+                <w:szCs w:val="18"/>
               </w:rPr>
               <w:t>After Effects, Premiere</w:t>
             </w:r>
           </w:p>
           <w:p>
             <w:pPr>
-              <w:spacing w:after="60"/>
-            </w:pPr>
-            <w:r>
-              <w:rPr>
-                <w:sz w:val="19"/>
-                <w:szCs w:val="19"/>
+              <w:spacing w:after="40"/>
+            </w:pPr>
+            <w:r>
+              <w:rPr>
+                <w:color w:val="555555"/>
+                <w:sz w:val="18"/>
+                <w:szCs w:val="18"/>
               </w:rPr>
               <w:t>Blender</w:t>
             </w:r>
           </w:p>
           <w:p>
             <w:pPr>
-              <w:spacing w:after="60"/>
-            </w:pPr>
-            <w:r>
-              <w:rPr>
-                <w:sz w:val="19"/>
-                <w:szCs w:val="19"/>
+              <w:spacing w:after="40"/>
+            </w:pPr>
+            <w:r>
+              <w:rPr>
+                <w:color w:val="555555"/>
+                <w:sz w:val="18"/>
+                <w:szCs w:val="18"/>
               </w:rPr>
               <w:t>HTML / CSS / JS</w:t>
             </w:r>
           </w:p>
           <w:p>
             <w:pPr>
-              <w:spacing w:after="200"/>
-            </w:pPr>
-            <w:r>
-              <w:rPr>
-                <w:sz w:val="19"/>
-                <w:szCs w:val="19"/>
+              <w:spacing w:after="40"/>
+            </w:pPr>
+            <w:r>
+              <w:rPr>
+                <w:color w:val="555555"/>
+                <w:sz w:val="18"/>
+                <w:szCs w:val="18"/>
               </w:rPr>
               <w:t>AI workflows (Claude, Midjourney)</w:t>
             </w:r>
           </w:p>
           <w:p>
             <w:pPr>
-              <w:spacing w:after="160"/>
+              <w:pBdr>
+                <w:bottom w:val="single" w:sz="4" w:space="2" w:color="CCCCCC"/>
+              </w:pBdr>
+              <w:spacing w:before="200" w:after="100"/>
             </w:pPr>
             <w:r>
               <w:rPr>
                 <w:b/>
                 <w:bCs/>
                 <w:caps/>
-              </w:rPr>
-              <w:t>EDUCATION</w:t>
+                <w:color w:val="222222"/>
+                <w:sz w:val="17"/>
+                <w:szCs w:val="17"/>
+              </w:rPr>
+              <w:t>Education</w:t>
             </w:r>
           </w:p>
           <w:p>
@@ -715,12 +1408,31 @@
             </w:pPr>
             <w:r>
               <w:rPr>
-                <w:b/>
-                <w:bCs/>
-                <w:sz w:val="19"/>
-                <w:szCs w:val="19"/>
-              </w:rPr>
-              <w:t>Honours B.Des</w:t>
+                <w:color w:val="555555"/>
+                <w:sz w:val="18"/>
+                <w:szCs w:val="18"/>
+              </w:rPr>
+              <w:t xml:space="preserve">Honours </w:t>
+            </w:r>
+            <w:proofErr w:type="spellStart"/>
+            <w:proofErr w:type="gramStart"/>
+            <w:r>
+              <w:rPr>
+                <w:color w:val="555555"/>
+                <w:sz w:val="18"/>
+                <w:szCs w:val="18"/>
+              </w:rPr>
+              <w:t>B.Des</w:t>
+            </w:r>
+            <w:proofErr w:type="spellEnd"/>
+            <w:proofErr w:type="gramEnd"/>
+            <w:r>
+              <w:rPr>
+                <w:color w:val="555555"/>
+                <w:sz w:val="18"/>
+                <w:szCs w:val="18"/>
+              </w:rPr>
+              <w:t>, Graphic Design</w:t>
             </w:r>
           </w:p>
           <w:p>
@@ -729,44 +1441,30 @@
             </w:pPr>
             <w:r>
               <w:rPr>
-                <w:sz w:val="19"/>
-                <w:szCs w:val="19"/>
-              </w:rPr>
-              <w:t>Graphic Design</w:t>
-            </w:r>
-          </w:p>
-          <w:p>
-            <w:pPr>
-              <w:spacing w:after="200"/>
-            </w:pPr>
-            <w:r>
-              <w:rPr>
-                <w:color w:val="888888"/>
-                <w:sz w:val="18"/>
-                <w:szCs w:val="18"/>
-              </w:rPr>
-              <w:t>OCAD University, 201</w:t>
-            </w:r>
-            <w:r>
-              <w:rPr>
-                <w:color w:val="888888"/>
-                <w:sz w:val="18"/>
-                <w:szCs w:val="18"/>
-              </w:rPr>
-              <w:t>4-2018</w:t>
-            </w:r>
-          </w:p>
-          <w:p>
-            <w:pPr>
-              <w:spacing w:after="160"/>
+                <w:color w:val="555555"/>
+                <w:sz w:val="18"/>
+                <w:szCs w:val="18"/>
+              </w:rPr>
+              <w:t>OCAD University, 2014–2018</w:t>
+            </w:r>
+          </w:p>
+          <w:p>
+            <w:pPr>
+              <w:pBdr>
+                <w:bottom w:val="single" w:sz="4" w:space="2" w:color="CCCCCC"/>
+              </w:pBdr>
+              <w:spacing w:before="200" w:after="100"/>
             </w:pPr>
             <w:r>
               <w:rPr>
                 <w:b/>
                 <w:bCs/>
                 <w:caps/>
-              </w:rPr>
-              <w:t>LANGUAGES</w:t>
+                <w:color w:val="222222"/>
+                <w:sz w:val="17"/>
+                <w:szCs w:val="17"/>
+              </w:rPr>
+              <w:t>Languages</w:t>
             </w:r>
           </w:p>
           <w:p>
@@ -775,8 +1473,9 @@
             </w:pPr>
             <w:r>
               <w:rPr>
-                <w:sz w:val="19"/>
-                <w:szCs w:val="19"/>
+                <w:color w:val="555555"/>
+                <w:sz w:val="18"/>
+                <w:szCs w:val="18"/>
               </w:rPr>
               <w:t>English (native)</w:t>
             </w:r>
@@ -787,7 +1486,7 @@
     <w:p/>
     <w:sectPr>
       <w:pgSz w:w="12240" w:h="15840"/>
-      <w:pgMar w:top="576" w:right="576" w:bottom="576" w:left="576" w:header="708" w:footer="708" w:gutter="0"/>
+      <w:pgMar w:top="1080" w:right="1440" w:bottom="1080" w:left="1440" w:header="708" w:footer="708" w:gutter="0"/>
       <w:cols w:space="720"/>
       <w:docGrid w:linePitch="360"/>
     </w:sectPr>
@@ -798,10 +1497,10 @@
 <file path=word/numbering.xml><?xml version="1.0" encoding="utf-8"?>
 <w:numbering xmlns:wpc="http://schemas.microsoft.com/office/word/2010/wordprocessingCanvas" xmlns:cx="http://schemas.microsoft.com/office/drawing/2014/chartex" xmlns:cx1="http://schemas.microsoft.com/office/drawing/2015/9/8/chartex" xmlns:cx2="http://schemas.microsoft.com/office/drawing/2015/10/21/chartex" xmlns:cx3="http://schemas.microsoft.com/office/drawing/2016/5/9/chartex" xmlns:cx4="http://schemas.microsoft.com/office/drawing/2016/5/10/chartex" xmlns:cx5="http://schemas.microsoft.com/office/drawing/2016/5/11/chartex" xmlns:cx6="http://schemas.microsoft.com/office/drawing/2016/5/12/chartex" xmlns:cx7="http://schemas.microsoft.com/office/drawing/2016/5/13/chartex" xmlns:cx8="http://schemas.microsoft.com/office/drawing/2016/5/14/chartex" xmlns:mc="http://schemas.openxmlformats.org/markup-compatibility/2006" xmlns:aink="http://schemas.microsoft.com/office/drawing/2016/ink" xmlns:am3d="http://schemas.microsoft.com/office/drawing/2017/model3d" xmlns:o="urn:schemas-microsoft-com:office:office" xmlns:oel="http://schemas.microsoft.com/office/2019/extlst" xmlns:r="http://schemas.openxmlformats.org/officeDocument/2006/relationships" xmlns:m="http://schemas.openxmlformats.org/officeDocument/2006/math" xmlns:v="urn:schemas-microsoft-com:vml" xmlns:wp14="http://schemas.microsoft.com/office/word/2010/wordprocessingDrawing" xmlns:wp="http://schemas.openxmlformats.org/drawingml/2006/wordprocessingDrawing" xmlns:w10="urn:schemas-microsoft-com:office:word" xmlns:w="http://schemas.openxmlformats.org/wordprocessingml/2006/main" xmlns:w14="http://schemas.microsoft.com/office/word/2010/wordml" xmlns:w15="http://schemas.microsoft.com/office/word/2012/wordml" xmlns:w16cex="http://schemas.microsoft.com/office/word/2018/wordml/cex" xmlns:w16cid="http://schemas.microsoft.com/office/word/2016/wordml/cid" xmlns:w16="http://schemas.microsoft.com/office/word/2018/wordml" xmlns:w16du="http://schemas.microsoft.com/office/word/2023/wordml/word16du" xmlns:w16sdtdh="http://schemas.microsoft.com/office/word/2020/wordml/sdtdatahash" xmlns:w16sdtfl="http://schemas.microsoft.com/office/word/2024/wordml/sdtformatlock" xmlns:w16se="http://schemas.microsoft.com/office/word/2015/wordml/symex" xmlns:wpg="http://schemas.microsoft.com/office/word/2010/wordprocessingGroup" xmlns:wpi="http://schemas.microsoft.com/office/word/2010/wordprocessingInk" xmlns:wne="http://schemas.microsoft.com/office/word/2006/wordml" xmlns:wps="http://schemas.microsoft.com/office/word/2010/wordprocessingShape" mc:Ignorable="w14 w15 w16se w16cid w16 w16cex w16sdtdh w16sdtfl w16du wp14">
   <w:abstractNum w:abstractNumId="0" w15:restartNumberingAfterBreak="0">
-    <w:nsid w:val="07D34748"/>
+    <w:nsid w:val="63493BD3"/>
     <w:multiLevelType w:val="hybridMultilevel"/>
-    <w:tmpl w:val="CBDAE3B6"/>
-    <w:lvl w:ilvl="0" w:tplc="811459F2">
+    <w:tmpl w:val="97F29730"/>
+    <w:lvl w:ilvl="0" w:tplc="B4A6E328">
       <w:start w:val="1"/>
       <w:numFmt w:val="bullet"/>
       <w:lvlText w:val="●"/>
@@ -810,7 +1509,7 @@
         <w:ind w:left="720" w:hanging="360"/>
       </w:pPr>
     </w:lvl>
-    <w:lvl w:ilvl="1" w:tplc="FF563F46">
+    <w:lvl w:ilvl="1" w:tplc="1E3C249C">
       <w:start w:val="1"/>
       <w:numFmt w:val="bullet"/>
       <w:lvlText w:val="○"/>
@@ -819,7 +1518,7 @@
         <w:ind w:left="1440" w:hanging="360"/>
       </w:pPr>
     </w:lvl>
-    <w:lvl w:ilvl="2" w:tplc="D0F24ABA">
+    <w:lvl w:ilvl="2" w:tplc="DA74265A">
       <w:start w:val="1"/>
       <w:numFmt w:val="bullet"/>
       <w:lvlText w:val="■"/>
@@ -828,7 +1527,7 @@
         <w:ind w:left="2160" w:hanging="360"/>
       </w:pPr>
     </w:lvl>
-    <w:lvl w:ilvl="3" w:tplc="3BF69822">
+    <w:lvl w:ilvl="3" w:tplc="A0BCDB60">
       <w:start w:val="1"/>
       <w:numFmt w:val="bullet"/>
       <w:lvlText w:val="●"/>
@@ -837,7 +1536,7 @@
         <w:ind w:left="2880" w:hanging="360"/>
       </w:pPr>
     </w:lvl>
-    <w:lvl w:ilvl="4" w:tplc="CF5C8BB8">
+    <w:lvl w:ilvl="4" w:tplc="741AAC12">
       <w:start w:val="1"/>
       <w:numFmt w:val="bullet"/>
       <w:lvlText w:val="○"/>
@@ -846,7 +1545,7 @@
         <w:ind w:left="3600" w:hanging="360"/>
       </w:pPr>
     </w:lvl>
-    <w:lvl w:ilvl="5" w:tplc="9DB6DB22">
+    <w:lvl w:ilvl="5" w:tplc="B6FC879C">
       <w:start w:val="1"/>
       <w:numFmt w:val="bullet"/>
       <w:lvlText w:val="■"/>
@@ -855,7 +1554,7 @@
         <w:ind w:left="4320" w:hanging="360"/>
       </w:pPr>
     </w:lvl>
-    <w:lvl w:ilvl="6" w:tplc="269A6A44">
+    <w:lvl w:ilvl="6" w:tplc="000642EC">
       <w:start w:val="1"/>
       <w:numFmt w:val="bullet"/>
       <w:lvlText w:val="●"/>
@@ -864,7 +1563,7 @@
         <w:ind w:left="5040" w:hanging="360"/>
       </w:pPr>
     </w:lvl>
-    <w:lvl w:ilvl="7" w:tplc="4A307388">
+    <w:lvl w:ilvl="7" w:tplc="EABCEAA8">
       <w:start w:val="1"/>
       <w:numFmt w:val="bullet"/>
       <w:lvlText w:val="●"/>
@@ -873,7 +1572,7 @@
         <w:ind w:left="5760" w:hanging="360"/>
       </w:pPr>
     </w:lvl>
-    <w:lvl w:ilvl="8" w:tplc="BF48D356">
+    <w:lvl w:ilvl="8" w:tplc="D53CE562">
       <w:start w:val="1"/>
       <w:numFmt w:val="bullet"/>
       <w:lvlText w:val="●"/>
@@ -883,7 +1582,7 @@
       </w:pPr>
     </w:lvl>
   </w:abstractNum>
-  <w:num w:numId="1" w16cid:durableId="346256208">
+  <w:num w:numId="1" w16cid:durableId="2106918528">
     <w:abstractNumId w:val="0"/>
     <w:lvlOverride w:ilvl="0">
       <w:startOverride w:val="1"/>
@@ -898,7 +1597,6 @@
     <w:rPrDefault>
       <w:rPr>
         <w:rFonts w:ascii="Arial" w:eastAsia="Arial" w:hAnsi="Arial" w:cs="Arial"/>
-        <w:color w:val="1A1A1A"/>
         <w:lang w:val="en-CA" w:eastAsia="en-US" w:bidi="ar-SA"/>
       </w:rPr>
     </w:rPrDefault>
@@ -1454,6 +2152,33 @@
       <w:szCs w:val="20"/>
     </w:rPr>
   </w:style>
+  <w:style w:type="character" w:styleId="EndnoteReference">
+    <w:name w:val="endnote reference"/>
+    <w:uiPriority w:val="99"/>
+    <w:semiHidden/>
+    <w:unhideWhenUsed/>
+    <w:rPr>
+      <w:vertAlign w:val="superscript"/>
+    </w:rPr>
+  </w:style>
+  <w:style w:type="paragraph" w:styleId="EndnoteText">
+    <w:name w:val="endnote text"/>
+    <w:link w:val="EndnoteTextChar"/>
+    <w:uiPriority w:val="99"/>
+    <w:semiHidden/>
+    <w:unhideWhenUsed/>
+  </w:style>
+  <w:style w:type="character" w:customStyle="1" w:styleId="EndnoteTextChar">
+    <w:name w:val="Endnote Text Char"/>
+    <w:link w:val="EndnoteText"/>
+    <w:uiPriority w:val="99"/>
+    <w:semiHidden/>
+    <w:unhideWhenUsed/>
+    <w:rPr>
+      <w:sz w:val="20"/>
+      <w:szCs w:val="20"/>
+    </w:rPr>
+  </w:style>
 </w:styles>
 </file>
 

</xml_diff>